<commit_message>
Week 9 labs completed
</commit_message>
<xml_diff>
--- a/Assignment1/Assignment1.docx
+++ b/Assignment1/Assignment1.docx
@@ -721,7 +721,13 @@
         <w:t xml:space="preserve">Fonts: Throughout my website I would use different heading sizes. </w:t>
       </w:r>
       <w:r>
-        <w:t xml:space="preserve">But also use the same font across all the website to help create a consistent look . For heading I would use italic style and use fonts such as </w:t>
+        <w:t>But also use the same font across all the website to help create a consistent look . For heading</w:t>
+      </w:r>
+      <w:r>
+        <w:t xml:space="preserve">s </w:t>
+      </w:r>
+      <w:r>
+        <w:t xml:space="preserve">I would use italic style and use fonts such as </w:t>
       </w:r>
       <w:r>
         <w:t>Georgia, Times, serif</w:t>
@@ -1894,6 +1900,7 @@
   <w:style w:type="character" w:default="1" w:styleId="DefaultParagraphFont">
     <w:name w:val="Default Paragraph Font"/>
     <w:uiPriority w:val="1"/>
+    <w:semiHidden/>
     <w:unhideWhenUsed/>
   </w:style>
   <w:style w:type="table" w:default="1" w:styleId="TableNormal">

</xml_diff>